<commit_message>
Add master project report PDF and finalize workflow updates
</commit_message>
<xml_diff>
--- a/Report/S8_FINAL_REPORT.docx
+++ b/Report/S8_FINAL_REPORT.docx
@@ -911,7 +911,6 @@
         </w:rPr>
         <w:t>R (7376222AL131</w:t>
       </w:r>
-      <w:proofErr w:type="gramStart"/>
       <w:r>
         <w:rPr>
           <w:b/>
@@ -948,7 +947,6 @@
         </w:rPr>
         <w:t xml:space="preserve">  </w:t>
       </w:r>
-      <w:proofErr w:type="gramEnd"/>
       <w:r>
         <w:rPr>
           <w:b/>
@@ -1407,11 +1405,9 @@
       <w:r>
         <w:t xml:space="preserve">and Machine Learning                                                   </w:t>
       </w:r>
-      <w:proofErr w:type="spellStart"/>
       <w:r>
         <w:t>Bannari</w:t>
       </w:r>
-      <w:proofErr w:type="spellEnd"/>
       <w:r>
         <w:rPr>
           <w:spacing w:val="-8"/>
@@ -1454,24 +1450,11 @@
       <w:r>
         <w:t xml:space="preserve">      </w:t>
       </w:r>
-      <w:proofErr w:type="spellStart"/>
-      <w:r>
-        <w:t>Bannari</w:t>
-      </w:r>
-      <w:proofErr w:type="spellEnd"/>
-      <w:r>
-        <w:t xml:space="preserve"> Amman Institute of Technology</w:t>
-      </w:r>
-      <w:r>
-        <w:t xml:space="preserve">                                </w:t>
-      </w:r>
-      <w:proofErr w:type="spellStart"/>
-      <w:r>
-        <w:t>Sathyamangalam</w:t>
-      </w:r>
-      <w:proofErr w:type="spellEnd"/>
-      <w:r>
-        <w:t>.</w:t>
+      <w:r>
+        <w:t>Bannari Amman Institute of Technology</w:t>
+      </w:r>
+      <w:r>
+        <w:t xml:space="preserve">                                Sathyamangalam.</w:t>
       </w:r>
       <w:r>
         <w:t xml:space="preserve">                     </w:t>
@@ -1482,13 +1465,8 @@
       <w:r>
         <w:t xml:space="preserve">      </w:t>
       </w:r>
-      <w:proofErr w:type="spellStart"/>
-      <w:r>
-        <w:t>Sathyamangalam</w:t>
-      </w:r>
-      <w:proofErr w:type="spellEnd"/>
-      <w:r>
-        <w:t>.</w:t>
+      <w:r>
+        <w:t>Sathyamangalam.</w:t>
       </w:r>
     </w:p>
     <w:p>
@@ -2738,7 +2716,6 @@
         </w:rPr>
         <w:t xml:space="preserve">  </w:t>
       </w:r>
-      <w:proofErr w:type="gramStart"/>
       <w:r>
         <w:rPr>
           <w:b/>
@@ -2761,16 +2738,7 @@
           <w:bCs/>
           <w:spacing w:val="-2"/>
         </w:rPr>
-        <w:t>(</w:t>
-      </w:r>
-      <w:proofErr w:type="gramEnd"/>
-      <w:r>
-        <w:rPr>
-          <w:b/>
-          <w:bCs/>
-          <w:spacing w:val="-2"/>
-        </w:rPr>
-        <w:t>7376222AL1</w:t>
+        <w:t>(7376222AL1</w:t>
       </w:r>
       <w:r>
         <w:rPr>
@@ -6832,8 +6800,6 @@
                 <w:t>8</w:t>
               </w:r>
             </w:ins>
-            <w:bookmarkStart w:id="4" w:name="_GoBack"/>
-            <w:bookmarkEnd w:id="4"/>
           </w:p>
         </w:tc>
       </w:tr>
@@ -7365,7 +7331,7 @@
           <w:p>
             <w:pPr>
               <w:pStyle w:val="TableParagraph"/>
-              <w:spacing w:after="240" w:line="360" w:lineRule="auto"/>
+              <w:spacing w:after="240"/>
               <w:ind w:right="777"/>
               <w:jc w:val="center"/>
               <w:rPr>
@@ -7377,11 +7343,10 @@
             <w:r>
               <w:rPr>
                 <w:b/>
-                <w:spacing w:val="-2"/>
                 <w:sz w:val="24"/>
                 <w:szCs w:val="24"/>
               </w:rPr>
-              <w:t>SI.NO</w:t>
+              <w:t>FIG NO.</w:t>
             </w:r>
           </w:p>
         </w:tc>
@@ -7405,7 +7370,17 @@
                 <w:sz w:val="24"/>
                 <w:szCs w:val="24"/>
               </w:rPr>
-              <w:t xml:space="preserve">                  </w:t>
+              <w:t xml:space="preserve">            </w:t>
+            </w:r>
+            <w:bookmarkStart w:id="4" w:name="_GoBack"/>
+            <w:bookmarkEnd w:id="4"/>
+            <w:r>
+              <w:rPr>
+                <w:b/>
+                <w:sz w:val="24"/>
+                <w:szCs w:val="24"/>
+              </w:rPr>
+              <w:t xml:space="preserve">      </w:t>
             </w:r>
             <w:r>
               <w:rPr>
@@ -15048,21 +15023,7 @@
         <w:rPr>
           <w:sz w:val="26"/>
         </w:rPr>
-        <w:t xml:space="preserve"> </w:t>
-      </w:r>
-      <w:proofErr w:type="spellStart"/>
-      <w:r>
-        <w:rPr>
-          <w:sz w:val="26"/>
-        </w:rPr>
-        <w:t>Git</w:t>
-      </w:r>
-      <w:proofErr w:type="spellEnd"/>
-      <w:r>
-        <w:rPr>
-          <w:sz w:val="26"/>
-        </w:rPr>
-        <w:t xml:space="preserve"> integrates well with CI/CD pipelines, enabling automated testing, deployment, and monitoring of changes, enhancing the overall development workflow.</w:t>
+        <w:t xml:space="preserve"> Git integrates well with CI/CD pipelines, enabling automated testing, deployment, and monitoring of changes, enhancing the overall development workflow.</w:t>
       </w:r>
     </w:p>
     <w:p>
@@ -16615,25 +16576,7 @@
           <w:sz w:val="26"/>
           <w:szCs w:val="26"/>
         </w:rPr>
-        <w:t xml:space="preserve">J. M. </w:t>
-      </w:r>
-      <w:proofErr w:type="spellStart"/>
-      <w:r>
-        <w:rPr>
-          <w:rStyle w:val="bzpyqfadein"/>
-          <w:sz w:val="26"/>
-          <w:szCs w:val="26"/>
-        </w:rPr>
-        <w:t>Fernández-Batanero</w:t>
-      </w:r>
-      <w:proofErr w:type="spellEnd"/>
-      <w:r>
-        <w:rPr>
-          <w:rStyle w:val="bzpyqfadein"/>
-          <w:sz w:val="26"/>
-          <w:szCs w:val="26"/>
-        </w:rPr>
-        <w:t xml:space="preserve">, M. Montenegro-Rueda, J. Fernández-Cerero, and I. García-Martínez, “Effectiveness of digital mental health interventions for children and adolescents: A systematic review,” </w:t>
+        <w:t xml:space="preserve">J. M. Fernández-Batanero, M. Montenegro-Rueda, J. Fernández-Cerero, and I. García-Martínez, “Effectiveness of digital mental health interventions for children and adolescents: A systematic review,” </w:t>
       </w:r>
       <w:r>
         <w:rPr>
@@ -16676,25 +16619,7 @@
           <w:sz w:val="26"/>
           <w:szCs w:val="26"/>
         </w:rPr>
-        <w:t xml:space="preserve">S. Liverpool, C. McDonagh, J. Feather, C. </w:t>
-      </w:r>
-      <w:proofErr w:type="spellStart"/>
-      <w:r>
-        <w:rPr>
-          <w:rStyle w:val="bzpyqfadein"/>
-          <w:sz w:val="26"/>
-          <w:szCs w:val="26"/>
-        </w:rPr>
-        <w:t>Uzondu</w:t>
-      </w:r>
-      <w:proofErr w:type="spellEnd"/>
-      <w:r>
-        <w:rPr>
-          <w:rStyle w:val="bzpyqfadein"/>
-          <w:sz w:val="26"/>
-          <w:szCs w:val="26"/>
-        </w:rPr>
-        <w:t xml:space="preserve">, M. Howarth, and C. Foster, “Digital mental health interventions for children and young people: Systematic overview of reviews,” </w:t>
+        <w:t xml:space="preserve">S. Liverpool, C. McDonagh, J. Feather, C. Uzondu, M. Howarth, and C. Foster, “Digital mental health interventions for children and young people: Systematic overview of reviews,” </w:t>
       </w:r>
       <w:r>
         <w:rPr>
@@ -16951,25 +16876,7 @@
           <w:sz w:val="26"/>
           <w:szCs w:val="26"/>
         </w:rPr>
-        <w:t xml:space="preserve">K. Di </w:t>
-      </w:r>
-      <w:proofErr w:type="spellStart"/>
-      <w:r>
-        <w:rPr>
-          <w:rStyle w:val="bzpyqfadein"/>
-          <w:sz w:val="26"/>
-          <w:szCs w:val="26"/>
-        </w:rPr>
-        <w:t>Pierdomenico</w:t>
-      </w:r>
-      <w:proofErr w:type="spellEnd"/>
-      <w:r>
-        <w:rPr>
-          <w:rStyle w:val="bzpyqfadein"/>
-          <w:sz w:val="26"/>
-          <w:szCs w:val="26"/>
-        </w:rPr>
-        <w:t xml:space="preserve"> et al., “Universal digital mental health interventions for children and adolescents: Evidence and future perspectives,” </w:t>
+        <w:t xml:space="preserve">K. Di Pierdomenico et al., “Universal digital mental health interventions for children and adolescents: Evidence and future perspectives,” </w:t>
       </w:r>
       <w:r>
         <w:rPr>
@@ -17030,25 +16937,7 @@
           <w:sz w:val="26"/>
           <w:szCs w:val="26"/>
         </w:rPr>
-        <w:t xml:space="preserve">, vol. 3, no. 2, pp. 50–62, 2025.M. Asif, S. Mishra, A. </w:t>
-      </w:r>
-      <w:proofErr w:type="spellStart"/>
-      <w:r>
-        <w:rPr>
-          <w:rStyle w:val="bzpyqfadein"/>
-          <w:sz w:val="26"/>
-          <w:szCs w:val="26"/>
-        </w:rPr>
-        <w:t>Sonker</w:t>
-      </w:r>
-      <w:proofErr w:type="spellEnd"/>
-      <w:r>
-        <w:rPr>
-          <w:rStyle w:val="bzpyqfadein"/>
-          <w:sz w:val="26"/>
-          <w:szCs w:val="26"/>
-        </w:rPr>
-        <w:t xml:space="preserve">, S. Gupta, and S. Maurya, “Proactive emotion </w:t>
+        <w:t xml:space="preserve">, vol. 3, no. 2, pp. 50–62, 2025.M. Asif, S. Mishra, A. Sonker, S. Gupta, and S. Maurya, “Proactive emotion </w:t>
       </w:r>
       <w:r>
         <w:rPr>
@@ -17059,7 +16948,6 @@
         <w:lastRenderedPageBreak/>
         <w:t xml:space="preserve">tracker: AI-driven continuous mood monitoring,” </w:t>
       </w:r>
-      <w:proofErr w:type="spellStart"/>
       <w:r>
         <w:rPr>
           <w:rStyle w:val="bzpyqfadein"/>
@@ -17068,18 +16956,7 @@
           <w:sz w:val="26"/>
           <w:szCs w:val="26"/>
         </w:rPr>
-        <w:t>arXiv</w:t>
-      </w:r>
-      <w:proofErr w:type="spellEnd"/>
-      <w:r>
-        <w:rPr>
-          <w:rStyle w:val="bzpyqfadein"/>
-          <w:i/>
-          <w:iCs/>
-          <w:sz w:val="26"/>
-          <w:szCs w:val="26"/>
-        </w:rPr>
-        <w:t xml:space="preserve"> preprint arXiv:2401.13722</w:t>
+        <w:t>arXiv preprint arXiv:2401.13722</w:t>
       </w:r>
       <w:r>
         <w:rPr>
@@ -17112,25 +16989,7 @@
           <w:sz w:val="26"/>
           <w:szCs w:val="26"/>
         </w:rPr>
-        <w:t xml:space="preserve">D. B. </w:t>
-      </w:r>
-      <w:proofErr w:type="spellStart"/>
-      <w:r>
-        <w:rPr>
-          <w:rStyle w:val="bzpyqfadein"/>
-          <w:sz w:val="26"/>
-          <w:szCs w:val="26"/>
-        </w:rPr>
-        <w:t>Olawade</w:t>
-      </w:r>
-      <w:proofErr w:type="spellEnd"/>
-      <w:r>
-        <w:rPr>
-          <w:rStyle w:val="bzpyqfadein"/>
-          <w:sz w:val="26"/>
-          <w:szCs w:val="26"/>
-        </w:rPr>
-        <w:t xml:space="preserve">, O. Z. Wada, A. C. David-Olawade, and A. O. Ige, “Artificial intelligence in mental healthcare: Current trends and future directions,” </w:t>
+        <w:t xml:space="preserve">D. B. Olawade, O. Z. Wada, A. C. David-Olawade, and A. O. Ige, “Artificial intelligence in mental healthcare: Current trends and future directions,” </w:t>
       </w:r>
       <w:r>
         <w:rPr>
@@ -17173,25 +17032,7 @@
           <w:sz w:val="26"/>
           <w:szCs w:val="26"/>
         </w:rPr>
-        <w:t xml:space="preserve">S. </w:t>
-      </w:r>
-      <w:proofErr w:type="spellStart"/>
-      <w:r>
-        <w:rPr>
-          <w:rStyle w:val="bzpyqfadein"/>
-          <w:sz w:val="26"/>
-          <w:szCs w:val="26"/>
-        </w:rPr>
-        <w:t>Torous</w:t>
-      </w:r>
-      <w:proofErr w:type="spellEnd"/>
-      <w:r>
-        <w:rPr>
-          <w:rStyle w:val="bzpyqfadein"/>
-          <w:sz w:val="26"/>
-          <w:szCs w:val="26"/>
-        </w:rPr>
-        <w:t xml:space="preserve"> and J. Wisniewski, “Digital mental health and artificial intelligence: The future of mental healthcare,” </w:t>
+        <w:t xml:space="preserve">S. Torous and J. Wisniewski, “Digital mental health and artificial intelligence: The future of mental healthcare,” </w:t>
       </w:r>
       <w:r>
         <w:rPr>
@@ -17319,25 +17160,7 @@
           <w:sz w:val="26"/>
           <w:szCs w:val="26"/>
         </w:rPr>
-        <w:t xml:space="preserve">L. </w:t>
-      </w:r>
-      <w:proofErr w:type="spellStart"/>
-      <w:r>
-        <w:rPr>
-          <w:rStyle w:val="bzpyqfadein"/>
-          <w:sz w:val="26"/>
-          <w:szCs w:val="26"/>
-        </w:rPr>
-        <w:t>Torous</w:t>
-      </w:r>
-      <w:proofErr w:type="spellEnd"/>
-      <w:r>
-        <w:rPr>
-          <w:rStyle w:val="bzpyqfadein"/>
-          <w:sz w:val="26"/>
-          <w:szCs w:val="26"/>
-        </w:rPr>
-        <w:t xml:space="preserve">, J. Bucci, and I. Bell, “The growing field of digital psychiatry: Current evidence and future directions,” </w:t>
+        <w:t xml:space="preserve">L. Torous, J. Bucci, and I. Bell, “The growing field of digital psychiatry: Current evidence and future directions,” </w:t>
       </w:r>
       <w:r>
         <w:rPr>
@@ -19640,8 +19463,10 @@
         <w:rPr>
           <w:b/>
           <w:bCs/>
+          <w:noProof/>
           <w:sz w:val="28"/>
           <w:szCs w:val="28"/>
+          <w:lang w:val="en-IN" w:eastAsia="en-IN"/>
         </w:rPr>
         <w:drawing>
           <wp:inline distT="0" distB="0" distL="0" distR="0" wp14:anchorId="4706CD7E" wp14:editId="184A23D2">
@@ -20290,7 +20115,7 @@
                               <w:noProof/>
                               <w:spacing w:val="-5"/>
                             </w:rPr>
-                            <w:t>56</w:t>
+                            <w:t>4</w:t>
                           </w:r>
                           <w:r>
                             <w:rPr>
@@ -20348,7 +20173,7 @@
                         <w:noProof/>
                         <w:spacing w:val="-5"/>
                       </w:rPr>
-                      <w:t>56</w:t>
+                      <w:t>4</w:t>
                     </w:r>
                     <w:r>
                       <w:rPr>
@@ -24845,7 +24670,7 @@
 </file>
 
 <file path=customXml/itemProps1.xml><?xml version="1.0" encoding="utf-8"?>
-<ds:datastoreItem xmlns:ds="http://schemas.openxmlformats.org/officeDocument/2006/customXml" ds:itemID="{066AA50D-E807-4D2C-87AC-77E9F0C6B98C}">
+<ds:datastoreItem xmlns:ds="http://schemas.openxmlformats.org/officeDocument/2006/customXml" ds:itemID="{CC66B94C-410A-40A4-9EB9-7E96080B47A5}">
   <ds:schemaRefs>
     <ds:schemaRef ds:uri="http://schemas.openxmlformats.org/officeDocument/2006/bibliography"/>
   </ds:schemaRefs>

</xml_diff>